<commit_message>
chore: regenerate template binaries (auto)
</commit_message>
<xml_diff>
--- a/public/downloads/appliance-repair-invoice-template.docx
+++ b/public/downloads/appliance-repair-invoice-template.docx
@@ -611,6 +611,126 @@
           </w:p>
         </w:tc>
       </w:tr>
+      <w:tr>
+        <w:tc>
+          <w:tcPr>
+            <w:tcW w:type="dxa" w:w="1728"/>
+          </w:tcPr>
+          <w:p>
+            <w:r>
+              <w:t>DEPOSIT RECEIVED (25%)</w:t>
+            </w:r>
+          </w:p>
+        </w:tc>
+        <w:tc>
+          <w:tcPr>
+            <w:tcW w:type="dxa" w:w="1728"/>
+          </w:tcPr>
+          <w:p/>
+        </w:tc>
+        <w:tc>
+          <w:tcPr>
+            <w:tcW w:type="dxa" w:w="1728"/>
+          </w:tcPr>
+          <w:p/>
+        </w:tc>
+        <w:tc>
+          <w:tcPr>
+            <w:tcW w:type="dxa" w:w="1728"/>
+          </w:tcPr>
+          <w:p/>
+        </w:tc>
+        <w:tc>
+          <w:tcPr>
+            <w:tcW w:type="dxa" w:w="1728"/>
+          </w:tcPr>
+          <w:p>
+            <w:r>
+              <w:t>$113.75</w:t>
+            </w:r>
+          </w:p>
+        </w:tc>
+      </w:tr>
+      <w:tr>
+        <w:tc>
+          <w:tcPr>
+            <w:tcW w:type="dxa" w:w="1728"/>
+          </w:tcPr>
+          <w:p>
+            <w:r>
+              <w:t>AMOUNT PAID</w:t>
+            </w:r>
+          </w:p>
+        </w:tc>
+        <w:tc>
+          <w:tcPr>
+            <w:tcW w:type="dxa" w:w="1728"/>
+          </w:tcPr>
+          <w:p/>
+        </w:tc>
+        <w:tc>
+          <w:tcPr>
+            <w:tcW w:type="dxa" w:w="1728"/>
+          </w:tcPr>
+          <w:p/>
+        </w:tc>
+        <w:tc>
+          <w:tcPr>
+            <w:tcW w:type="dxa" w:w="1728"/>
+          </w:tcPr>
+          <w:p/>
+        </w:tc>
+        <w:tc>
+          <w:tcPr>
+            <w:tcW w:type="dxa" w:w="1728"/>
+          </w:tcPr>
+          <w:p>
+            <w:r>
+              <w:t>$0.00</w:t>
+            </w:r>
+          </w:p>
+        </w:tc>
+      </w:tr>
+      <w:tr>
+        <w:tc>
+          <w:tcPr>
+            <w:tcW w:type="dxa" w:w="1728"/>
+          </w:tcPr>
+          <w:p>
+            <w:r>
+              <w:t>BALANCE DUE</w:t>
+            </w:r>
+          </w:p>
+        </w:tc>
+        <w:tc>
+          <w:tcPr>
+            <w:tcW w:type="dxa" w:w="1728"/>
+          </w:tcPr>
+          <w:p/>
+        </w:tc>
+        <w:tc>
+          <w:tcPr>
+            <w:tcW w:type="dxa" w:w="1728"/>
+          </w:tcPr>
+          <w:p/>
+        </w:tc>
+        <w:tc>
+          <w:tcPr>
+            <w:tcW w:type="dxa" w:w="1728"/>
+          </w:tcPr>
+          <w:p/>
+        </w:tc>
+        <w:tc>
+          <w:tcPr>
+            <w:tcW w:type="dxa" w:w="1728"/>
+          </w:tcPr>
+          <w:p>
+            <w:r>
+              <w:t>$341.25</w:t>
+            </w:r>
+          </w:p>
+        </w:tc>
+      </w:tr>
     </w:tbl>
     <w:p/>
     <w:p>
@@ -621,6 +741,38 @@
     <w:p>
       <w:r>
         <w:t>Notes: Thank you for your business. Diagnostic fee is waived if you approve the repair. Brand and model should be listed on the work order for warranty tracking.</w:t>
+      </w:r>
+    </w:p>
+    <w:p>
+      <w:r>
+        <w:rPr>
+          <w:b/>
+        </w:rPr>
+        <w:t>PAYMENT</w:t>
+      </w:r>
+    </w:p>
+    <w:p>
+      <w:pPr>
+        <w:spacing w:after="0"/>
+      </w:pPr>
+      <w:r>
+        <w:t>Make checks payable to: ______</w:t>
+      </w:r>
+    </w:p>
+    <w:p>
+      <w:pPr>
+        <w:spacing w:after="0"/>
+      </w:pPr>
+      <w:r>
+        <w:t>Card / Venmo / Zelle: ______</w:t>
+      </w:r>
+    </w:p>
+    <w:p>
+      <w:pPr>
+        <w:spacing w:after="0"/>
+      </w:pPr>
+      <w:r>
+        <w:t>Pay online: ______</w:t>
       </w:r>
     </w:p>
     <w:p>

</xml_diff>